<commit_message>
Actualizacion de la semana 6
</commit_message>
<xml_diff>
--- a/3. Laboratorios/L3/Entregable 3.docx
+++ b/3. Laboratorios/L3/Entregable 3.docx
@@ -531,6 +531,41 @@
     </w:p>
     <w:p>
       <w:pPr>
+        <w:spacing w:after="200" w:before="0" w:line="360" w:lineRule="auto"/>
+        <w:jc w:val="both"/>
+        <w:rPr/>
+      </w:pPr>
+      <w:r>
+        <w:rPr>
+          <w:b w:val="1"/>
+          <w:bCs w:val="1"/>
+          <w:rtl w:val="0"/>
+        </w:rPr>
+        <w:t xml:space="preserve">Foco del equipo para las siguientes entregas.</w:t>
+      </w:r>
+      <w:r>
+        <w:rPr>
+          <w:rtl w:val="0"/>
+        </w:rPr>
+        <w:t xml:space="preserve"> Este entregable desarrolla, conforme lo exige el enunciado de la práctica, hipótesis de iniciativa y descripción As Is para los tres dolores críticos priorizados (DC1, DC2 y DC3), manteniendo el mismo nivel de rigor y de sustento en cada uno. A partir de esta entrega, el equipo concentra además el desarrollo de la iniciativa en el dolor DC3 —contratación de productos por canal digital—, seleccionado como proceso ancla del proyecto porque es el que ofrece mayor claridad y disponibilidad de información para el equipo: el área de prevención de fraude que sustenta a DC2 opera de forma aislada y confidencial, y el flujo de originación Pyme de DC1 corresponde a un segmento distinto al de retail </w:t>
+      </w:r>
+      <w:r>
+        <w:rPr>
+          <w:i w:val="1"/>
+          <w:iCs w:val="1"/>
+          <w:rtl w:val="0"/>
+        </w:rPr>
+        <w:t xml:space="preserve">(A. Moquillaza, comunicación personal, 11 de setiembre de 2026)</w:t>
+      </w:r>
+      <w:r>
+        <w:rPr>
+          <w:rtl w:val="0"/>
+        </w:rPr>
+        <w:t xml:space="preserve">. Esta decisión no reduce el alcance exigido en este documento: las hipótesis y la descripción As Is de DC1 y DC2 se mantienen desarrolladas en su totalidad en las secciones 5.2, 5.3, 6.1 y 6.2.</w:t>
+      </w:r>
+    </w:p>
+    <w:p>
+      <w:pPr>
         <w:pStyle w:val="Heading2"/>
         <w:spacing w:after="160" w:before="260" w:line="360" w:lineRule="auto"/>
         <w:rPr>
@@ -645,6 +680,7 @@
         </w:rPr>
         <w:t xml:space="preserve">. En mercados con reporte de resultados agregados, la automatización de la suscripción crediticia con IA se asocia a una mejora de 30 % en el tiempo de respuesta crediticia y a un incremento de 25 % en la tasa de aprobación sin incremento del riesgo </w:t>
       </w:r>
+      <w:commentRangeStart w:id="13"/>
       <w:r>
         <w:rPr>
           <w:i w:val="1"/>
@@ -652,6 +688,13 @@
           <w:rtl w:val="0"/>
         </w:rPr>
         <w:t xml:space="preserve">(Stealth Agents, 2026, con base en McKinsey y Zest AI)</w:t>
+      </w:r>
+      <w:commentRangeEnd w:id="13"/>
+      <w:r>
+        <w:rPr>
+          <w:rStyle w:val="CommentReference"/>
+        </w:rPr>
+        <w:commentReference w:id="13"/>
       </w:r>
       <w:r>
         <w:rPr>
@@ -1179,7 +1222,27 @@
         <w:rPr>
           <w:rtl w:val="0"/>
         </w:rPr>
-        <w:t xml:space="preserve"> Tasa de originación digital Pyme (línea base 33 %, meta 60 % en dieciocho meses) y tiempo de ciclo de la ruta asistida, hoy sin línea base pública y que el propio agente permitiría instrumentar por primera vez, conforme a la Tabla 23 del Entregable 2.</w:t>
+        <w:t xml:space="preserve"> Tasa de originación digital Pyme </w:t>
+      </w:r>
+      <w:commentRangeStart w:id="10"/>
+      <w:r>
+        <w:rPr>
+          <w:rtl w:val="0"/>
+        </w:rPr>
+        <w:t xml:space="preserve">(línea base 33 %, meta 60 % en dieciocho meses)</w:t>
+      </w:r>
+      <w:commentRangeEnd w:id="10"/>
+      <w:r>
+        <w:rPr>
+          <w:rStyle w:val="CommentReference"/>
+        </w:rPr>
+        <w:commentReference w:id="10"/>
+      </w:r>
+      <w:r>
+        <w:rPr>
+          <w:rtl w:val="0"/>
+        </w:rPr>
+        <w:t xml:space="preserve"> y tiempo de ciclo de la ruta asistida, hoy sin línea base pública y que el propio agente permitiría instrumentar por primera vez, conforme a la Tabla 23 del Entregable 2.</w:t>
       </w:r>
     </w:p>
     <w:p>
@@ -1298,6 +1361,7 @@
         </w:rPr>
         <w:t xml:space="preserve"> En el segmento de disputas y contracargos, la automatización con IA permite reducir la recopilación de evidencia de veinte o treinta minutos a menos de dos, y llevar la resolución de casos simples de semanas a horas, resolviendo de forma autónoma entre 70 % y 80 % de los casos cuando los hechos son claros </w:t>
       </w:r>
+      <w:commentRangeStart w:id="14"/>
       <w:r>
         <w:rPr>
           <w:i w:val="1"/>
@@ -1305,6 +1369,13 @@
           <w:rtl w:val="0"/>
         </w:rPr>
         <w:t xml:space="preserve">(Backbase, 2026)</w:t>
+      </w:r>
+      <w:commentRangeEnd w:id="14"/>
+      <w:r>
+        <w:rPr>
+          <w:rStyle w:val="CommentReference"/>
+        </w:rPr>
+        <w:commentReference w:id="14"/>
       </w:r>
       <w:r>
         <w:rPr>
@@ -1818,7 +1889,27 @@
         <w:rPr>
           <w:rtl w:val="0"/>
         </w:rPr>
-        <w:t xml:space="preserve"> Tiempo promedio de absolución (línea base 11.29 días, meta converger al promedio general de la entidad de 8.02 días) e incidencia de reclamos de la materia por cada cien mil operaciones, conforme a la Tabla 24 del Entregable 2.</w:t>
+        <w:t xml:space="preserve"> Tiempo promedio de absolución </w:t>
+      </w:r>
+      <w:commentRangeStart w:id="11"/>
+      <w:r>
+        <w:rPr>
+          <w:rtl w:val="0"/>
+        </w:rPr>
+        <w:t xml:space="preserve">(línea base 11.29 días, meta converger al promedio general de la entidad de 8.02 días)</w:t>
+      </w:r>
+      <w:commentRangeEnd w:id="11"/>
+      <w:r>
+        <w:rPr>
+          <w:rStyle w:val="CommentReference"/>
+        </w:rPr>
+        <w:commentReference w:id="11"/>
+      </w:r>
+      <w:r>
+        <w:rPr>
+          <w:rtl w:val="0"/>
+        </w:rPr>
+        <w:t xml:space="preserve"> e incidencia de reclamos de la materia por cada cien mil operaciones, conforme a la Tabla 24 del Entregable 2.</w:t>
       </w:r>
     </w:p>
     <w:p>
@@ -1923,6 +2014,7 @@
         </w:rPr>
         <w:t xml:space="preserve"> La automatización conversacional del onboarding bancario reduce el abandono de solicitudes hasta en 18 % y disminuye la carga manual de verificación de identidad </w:t>
       </w:r>
+      <w:commentRangeStart w:id="15"/>
       <w:r>
         <w:rPr>
           <w:i w:val="1"/>
@@ -1931,6 +2023,13 @@
         </w:rPr>
         <w:t xml:space="preserve">(Kore.ai, 2026)</w:t>
       </w:r>
+      <w:commentRangeEnd w:id="15"/>
+      <w:r>
+        <w:rPr>
+          <w:rStyle w:val="CommentReference"/>
+        </w:rPr>
+        <w:commentReference w:id="15"/>
+      </w:r>
       <w:r>
         <w:rPr>
           <w:rtl w:val="0"/>
@@ -1964,6 +2063,18 @@
           <w:rtl w:val="0"/>
         </w:rPr>
         <w:t xml:space="preserve">.</w:t>
+      </w:r>
+      <w:r>
+        <w:t xml:space="preserve"> A escala global, la tendencia no se limita a agentes bancarios transaccionales: en setiembre de 2026, Revolut lanzó en España y el resto de Europa un asistente conversacional de IA (Air) capaz de gestionar gastos, suscripciones, inversiones y beneficios de fidelización dentro de una misma conversación </w:t>
+      </w:r>
+      <w:r>
+        <w:rPr>
+          <w:i/>
+        </w:rPr>
+        <w:t>(Europa Press, 2026)</w:t>
+      </w:r>
+      <w:r>
+        <w:t>, lo que confirma que el mercado se desplaza hacia agentes de alcance amplio dentro de la experiencia financiera del usuario y no solo hacia bots de consulta puntual.</w:t>
       </w:r>
     </w:p>
     <w:p>
@@ -1985,6 +2096,27 @@
           <w:rtl w:val="0"/>
         </w:rPr>
         <w:t xml:space="preserve"> Que Mibanco y el BCP ya operen agentes conversacionales confirma que el canal conversacional en sí mismo es hoy un atributo de océano rojo: todo banco relevante del sistema se moverá hacia él. La evidencia pública no muestra que algún competidor peruano haya resuelto específicamente la verificación de perfiles borde sin derivación presencial; ese es el atributo puntual que esta hipótesis propone crear, y es el que convierte una función ya comoditizada —"conversar con un agente"— en una ventaja específica y medible frente al 67 % de cuentas que hoy se pierden hacia el canal asistido.</w:t>
+      </w:r>
+    </w:p>
+    <w:p>
+      <w:pPr>
+        <w:spacing w:after="200" w:before="0" w:line="360" w:lineRule="auto"/>
+        <w:jc w:val="both"/>
+        <w:rPr/>
+      </w:pPr>
+      <w:r>
+        <w:rPr>
+          <w:b w:val="1"/>
+          <w:bCs w:val="1"/>
+          <w:rtl w:val="0"/>
+        </w:rPr>
+        <w:t xml:space="preserve">Vínculo con el catálogo de servicios de TI.</w:t>
+      </w:r>
+      <w:r>
+        <w:rPr>
+          <w:rtl w:val="0"/>
+        </w:rPr>
+        <w:t xml:space="preserve"> Bajo el marco capacidad de negocio – servicio de TI trabajado en el curso, el proceso “Contratación de productos por canal digital” —que el equipo prioriza a partir de esta entrega y que puede modelarse como la capacidad de negocio que sostiene al dolor DC3— exige que el agente conversacional propuesto se registre como un servicio de TI explícito y no como una funcionalidad aislada: con un dueño de servicio definido, un nivel de disponibilidad comprometido y un lugar propio dentro del catálogo de servicios de BBVA Perú, conforme a la práctica de gestión de catálogo de servicios de ITIL4 para todo servicio que sostenga una capacidad de negocio priorizada.</w:t>
       </w:r>
     </w:p>
     <w:p>
@@ -2457,7 +2589,27 @@
         <w:rPr>
           <w:rtl w:val="0"/>
         </w:rPr>
-        <w:t xml:space="preserve"> Penetración digital en cuentas (línea base 33 %, meta 55 % en dieciocho meses) y tasa de derivación a canal asistido, hoy sin línea base pública y que el propio agente permitiría instrumentar por primera vez, conforme a la Tabla 25 del Entregable 2.</w:t>
+        <w:t xml:space="preserve"> Penetración digital en cuentas </w:t>
+      </w:r>
+      <w:commentRangeStart w:id="12"/>
+      <w:r>
+        <w:rPr>
+          <w:rtl w:val="0"/>
+        </w:rPr>
+        <w:t xml:space="preserve">(línea base 33 %, meta 55 % en dieciocho meses)</w:t>
+      </w:r>
+      <w:commentRangeEnd w:id="12"/>
+      <w:r>
+        <w:rPr>
+          <w:rStyle w:val="CommentReference"/>
+        </w:rPr>
+        <w:commentReference w:id="12"/>
+      </w:r>
+      <w:r>
+        <w:rPr>
+          <w:rtl w:val="0"/>
+        </w:rPr>
+        <w:t xml:space="preserve"> y tasa de derivación a canal asistido, hoy sin línea base pública y que el propio agente permitiría instrumentar por primera vez, conforme a la Tabla 25 del Entregable 2.</w:t>
       </w:r>
     </w:p>
     <w:p>
@@ -2712,6 +2864,7 @@
               <w:jc w:val="center"/>
               <w:rPr/>
             </w:pPr>
+            <w:commentRangeStart w:id="16"/>
             <w:r>
               <w:rPr>
                 <w:b w:val="1"/>
@@ -2720,6 +2873,13 @@
                 <w:rtl w:val="0"/>
               </w:rPr>
               <w:t xml:space="preserve">Objetivos estratégicos vinculados</w:t>
+            </w:r>
+            <w:commentRangeEnd w:id="16"/>
+            <w:r>
+              <w:rPr>
+                <w:rStyle w:val="CommentReference"/>
+              </w:rPr>
+              <w:commentReference w:id="16"/>
             </w:r>
             <w:r>
               <w:rPr>
@@ -3012,7 +3172,7 @@
               <w:rPr>
                 <w:rtl w:val="0"/>
               </w:rPr>
-              <w:t xml:space="preserve">DC3</w:t>
+              <w:t>DC3 (priorizado)</w:t>
             </w:r>
           </w:p>
         </w:tc>
@@ -3127,6 +3287,27 @@
           <w:rtl w:val="0"/>
         </w:rPr>
         <w:t xml:space="preserve">Elaboración propia con base en la Tabla 22 del Entregable 2 y en las hipótesis desarrolladas en las secciones 5.2 a 5.4.</w:t>
+      </w:r>
+    </w:p>
+    <w:p>
+      <w:pPr>
+        <w:spacing w:after="200" w:before="0" w:line="360" w:lineRule="auto"/>
+        <w:jc w:val="both"/>
+        <w:rPr/>
+      </w:pPr>
+      <w:r>
+        <w:rPr>
+          <w:b w:val="1"/>
+          <w:bCs w:val="1"/>
+          <w:rtl w:val="0"/>
+        </w:rPr>
+        <w:t xml:space="preserve">Priorización para las siguientes entregas.</w:t>
+      </w:r>
+      <w:r>
+        <w:rPr>
+          <w:rtl w:val="0"/>
+        </w:rPr>
+        <w:t xml:space="preserve"> Conforme a lo señalado en la sección 5.1, aunque las tres hipótesis de la Tabla 30 se desarrollan en este entregable con el mismo nivel de rigor, el equipo prioriza a partir de esta entrega el desarrollo de la iniciativa vinculada a DC3, en tanto la contratación de productos por canal digital ha sido seleccionada como el proceso de negocio ancla del proyecto. Las hipótesis de DC1 y DC2 permanecen vigentes como parte del alcance ya sustentado en este documento.</w:t>
       </w:r>
     </w:p>
     <w:p>
@@ -3708,7 +3889,21 @@
               <w:rPr>
                 <w:rtl w:val="0"/>
               </w:rPr>
-              <w:t xml:space="preserve">Ruta digital: 3 minutos promedio (Reusche, 2026) [F]. Ruta asistida: NO HAY FUENTES EN INTERNET DISPONIBLES; así consignado en la Tabla 23 del Entregable 2, que remite a levantamiento interno [V].</w:t>
+              <w:t xml:space="preserve">Ruta digital: 3 minutos promedio (Reusche, 2026) [F]. Ruta asistida: </w:t>
+            </w:r>
+            <w:commentRangeStart w:id="0"/>
+            <w:r>
+              <w:rPr>
+                <w:rtl w:val="0"/>
+              </w:rPr>
+              <w:t xml:space="preserve">NO HAY FUENTES EN INTERNET DISPONIBLES; así consignado en la Tabla 23 del Entregable 2, que remite a levantamiento interno [V].</w:t>
+            </w:r>
+            <w:commentRangeEnd w:id="0"/>
+            <w:r>
+              <w:rPr>
+                <w:rStyle w:val="CommentReference"/>
+              </w:rPr>
+              <w:commentReference w:id="0"/>
             </w:r>
           </w:p>
         </w:tc>
@@ -3770,11 +3965,25 @@
               <w:jc w:val="both"/>
               <w:rPr/>
             </w:pPr>
-            <w:r>
-              <w:rPr>
-                <w:rtl w:val="0"/>
-              </w:rPr>
-              <w:t xml:space="preserve">NO HAY FUENTES EN INTERNET DISPONIBLES sobre tasas de error o reproceso propias de BBVA Perú en esta etapa [V]. Referencia sectorial indirecta, no atribuible a BBVA: solo una de cada cuatro mypes peruanas accede a crédito por falta de información financiera verificable (Melo, 2026), lo que sugiere fricción recurrente en la etapa de evaluación sin que constituya una cifra de error operativo propiamente dicha [F sectorial].</w:t>
+            <w:commentRangeStart w:id="1"/>
+            <w:r>
+              <w:rPr>
+                <w:rtl w:val="0"/>
+              </w:rPr>
+              <w:t xml:space="preserve">NO HAY FUENTES EN INTERNET DISPONIBLES sobre tasas de error o reproceso propias de BBVA Perú en esta etapa [V].</w:t>
+            </w:r>
+            <w:commentRangeEnd w:id="1"/>
+            <w:r>
+              <w:rPr>
+                <w:rStyle w:val="CommentReference"/>
+              </w:rPr>
+              <w:commentReference w:id="1"/>
+            </w:r>
+            <w:r>
+              <w:rPr>
+                <w:rtl w:val="0"/>
+              </w:rPr>
+              <w:t xml:space="preserve"> Referencia sectorial indirecta, no atribuible a BBVA: solo una de cada cuatro mypes peruanas accede a crédito por falta de información financiera verificable (Melo, 2026), lo que sugiere fricción recurrente en la etapa de evaluación sin que constituya una cifra de error operativo propiamente dicha [F sectorial].</w:t>
             </w:r>
           </w:p>
         </w:tc>
@@ -3836,11 +4045,45 @@
               <w:jc w:val="both"/>
               <w:rPr/>
             </w:pPr>
-            <w:r>
-              <w:rPr>
-                <w:rtl w:val="0"/>
-              </w:rPr>
-              <w:t xml:space="preserve">NO HAY FUENTES EN INTERNET DISPONIBLES sobre el costo unitario de originación por canal en BBVA Perú; así consignado en la Tabla 23 del Entregable 2 [V]. Referencia internacional no extrapolable: la automatización con aprendizaje automático permite ahorrar hasta USD 1,500 por préstamo en el mercado hipotecario estadounidense (Freddie Mac, mayo de 2025, citado en Stealth Agents, 2026) [F referencial].</w:t>
+            <w:commentRangeStart w:id="2"/>
+            <w:r>
+              <w:rPr>
+                <w:rtl w:val="0"/>
+              </w:rPr>
+              <w:t xml:space="preserve">NO HAY FUENTES EN INTERNET DISPONIBLES sobre el costo unitario de originación por canal en BBVA Perú; así consignado en la Tabla 23 del Entregable 2 [V].</w:t>
+            </w:r>
+            <w:commentRangeEnd w:id="2"/>
+            <w:r>
+              <w:rPr>
+                <w:rStyle w:val="CommentReference"/>
+              </w:rPr>
+              <w:commentReference w:id="2"/>
+            </w:r>
+            <w:r>
+              <w:rPr>
+                <w:rtl w:val="0"/>
+              </w:rPr>
+              <w:t xml:space="preserve"> Referencia internacional no extrapolable: la automatización con aprendizaje automático permite ahorrar hasta USD 1,500 por préstamo en el mercado hipotecario estadounidense </w:t>
+            </w:r>
+            <w:commentRangeStart w:id="3"/>
+            <w:r>
+              <w:rPr>
+                <w:rtl w:val="0"/>
+              </w:rPr>
+              <w:t xml:space="preserve">(Freddie Mac, mayo de 2025, citado en Stealth Agents, 2026)</w:t>
+            </w:r>
+            <w:commentRangeEnd w:id="3"/>
+            <w:r>
+              <w:rPr>
+                <w:rStyle w:val="CommentReference"/>
+              </w:rPr>
+              <w:commentReference w:id="3"/>
+            </w:r>
+            <w:r>
+              <w:rPr>
+                <w:rtl w:val="0"/>
+              </w:rPr>
+              <w:t xml:space="preserve"> [F referencial].</w:t>
             </w:r>
           </w:p>
         </w:tc>
@@ -4494,11 +4737,25 @@
               <w:jc w:val="both"/>
               <w:rPr/>
             </w:pPr>
-            <w:r>
-              <w:rPr>
-                <w:rtl w:val="0"/>
-              </w:rPr>
-              <w:t xml:space="preserve">NO HAY FUENTES EN INTERNET DISPONIBLES sobre tipos de error operativo específicos de BBVA Perú en este proceso [V]. Evidencia indirecta de exposición: BBVA fue identificado entre las cinco entidades con mayor número de infracciones por operaciones no reconocidas en un reportaje de investigación (Alarcón, 2023), lo que sugiere fricciones recurrentes en la instrucción de los casos, sin que la fuente detalle la naturaleza exacta del error [F indirecto].</w:t>
+            <w:commentRangeStart w:id="4"/>
+            <w:r>
+              <w:rPr>
+                <w:rtl w:val="0"/>
+              </w:rPr>
+              <w:t xml:space="preserve">NO HAY FUENTES EN INTERNET DISPONIBLES sobre tipos de error operativo específicos de BBVA Perú en este proceso [V].</w:t>
+            </w:r>
+            <w:commentRangeEnd w:id="4"/>
+            <w:r>
+              <w:rPr>
+                <w:rStyle w:val="CommentReference"/>
+              </w:rPr>
+              <w:commentReference w:id="4"/>
+            </w:r>
+            <w:r>
+              <w:rPr>
+                <w:rtl w:val="0"/>
+              </w:rPr>
+              <w:t xml:space="preserve"> Evidencia indirecta de exposición: BBVA fue identificado entre las cinco entidades con mayor número de infracciones por operaciones no reconocidas en un reportaje de investigación (Alarcón, 2023), lo que sugiere fricciones recurrentes en la instrucción de los casos, sin que la fuente detalle la naturaleza exacta del error [F indirecto].</w:t>
             </w:r>
           </w:p>
         </w:tc>
@@ -4560,11 +4817,45 @@
               <w:jc w:val="both"/>
               <w:rPr/>
             </w:pPr>
-            <w:r>
-              <w:rPr>
-                <w:rtl w:val="0"/>
-              </w:rPr>
-              <w:t xml:space="preserve">Costo operativo propio de BBVA Perú por caso: NO HAY FUENTES EN INTERNET DISPONIBLES [V]. Cifra sectorial, no desagregada por entidad: 3,978.8 UIT en multas del Indecopi entre 2021 y marzo de 2025, de las cuales el 90 % (2,601 sanciones) recayó en el sistema financiero (Andina, 2025) [F sectorial]. Referencia internacional no extrapolable: los quince bancos más grandes de Estados Unidos destinan cerca de USD 3,000 millones anuales a la gestión de contracargos y disputas (Backbase, 2026) [F referencial].</w:t>
+            <w:commentRangeStart w:id="5"/>
+            <w:r>
+              <w:rPr>
+                <w:rtl w:val="0"/>
+              </w:rPr>
+              <w:t xml:space="preserve">Costo operativo propio de BBVA Perú por caso: NO HAY FUENTES EN INTERNET DISPONIBLES [V].</w:t>
+            </w:r>
+            <w:commentRangeEnd w:id="5"/>
+            <w:r>
+              <w:rPr>
+                <w:rStyle w:val="CommentReference"/>
+              </w:rPr>
+              <w:commentReference w:id="5"/>
+            </w:r>
+            <w:r>
+              <w:rPr>
+                <w:rtl w:val="0"/>
+              </w:rPr>
+              <w:t xml:space="preserve"> Cifra sectorial, no desagregada por entidad: 3,978.8 UIT en multas del Indecopi entre 2021 y marzo de 2025, de las cuales el 90 % (2,601 sanciones) recayó en el sistema financiero (Andina, 2025) [F sectorial]. Referencia internacional no extrapolable: los quince bancos más grandes de Estados Unidos destinan cerca de USD 3,000 millones anuales a la gestión de contracargos y disputas </w:t>
+            </w:r>
+            <w:commentRangeStart w:id="6"/>
+            <w:r>
+              <w:rPr>
+                <w:rtl w:val="0"/>
+              </w:rPr>
+              <w:t xml:space="preserve">(Backbase, 2026)</w:t>
+            </w:r>
+            <w:commentRangeEnd w:id="6"/>
+            <w:r>
+              <w:rPr>
+                <w:rStyle w:val="CommentReference"/>
+              </w:rPr>
+              <w:commentReference w:id="6"/>
+            </w:r>
+            <w:r>
+              <w:rPr>
+                <w:rtl w:val="0"/>
+              </w:rPr>
+              <w:t xml:space="preserve"> [F referencial].</w:t>
             </w:r>
           </w:p>
         </w:tc>
@@ -5156,7 +5447,21 @@
               <w:rPr>
                 <w:rtl w:val="0"/>
               </w:rPr>
-              <w:t xml:space="preserve">Proceso 100 % digital para no clientes: menos de 5 minutos. A. Moquillaza, comunicación personal, 11 de setiembre de 2026 [F]. Tiempo de la ruta derivada a oficina: NO HAY FUENTES EN INTERNET DISPONIBLES [V].</w:t>
+              <w:t xml:space="preserve">Proceso 100 % digital para no clientes: menos de 5 minutos. A. Moquillaza, comunicación personal, 11 de setiembre de 2026 [F]. </w:t>
+            </w:r>
+            <w:commentRangeStart w:id="7"/>
+            <w:r>
+              <w:rPr>
+                <w:rtl w:val="0"/>
+              </w:rPr>
+              <w:t xml:space="preserve">Tiempo de la ruta derivada a oficina: NO HAY FUENTES EN INTERNET DISPONIBLES [V].</w:t>
+            </w:r>
+            <w:commentRangeEnd w:id="7"/>
+            <w:r>
+              <w:rPr>
+                <w:rStyle w:val="CommentReference"/>
+              </w:rPr>
+              <w:commentReference w:id="7"/>
             </w:r>
           </w:p>
         </w:tc>
@@ -5218,11 +5523,25 @@
               <w:jc w:val="both"/>
               <w:rPr/>
             </w:pPr>
-            <w:r>
-              <w:rPr>
-                <w:rtl w:val="0"/>
-              </w:rPr>
-              <w:t xml:space="preserve">NO HAY FUENTES EN INTERNET DISPONIBLES sobre la tasa de abandono o error propia de BBVA Perú en este flujo; así consignado en la Tabla 25 del Entregable 2 [V]. Referencia de industria, no propia de BBVA Perú: la automatización conversacional del onboarding reduce el abandono de solicitudes hasta en 18 % (Kore.ai, 2026), lo que sugiere que el abandono es un fenómeno relevante en la industria [F referencial].</w:t>
+            <w:commentRangeStart w:id="8"/>
+            <w:r>
+              <w:rPr>
+                <w:rtl w:val="0"/>
+              </w:rPr>
+              <w:t xml:space="preserve">NO HAY FUENTES EN INTERNET DISPONIBLES sobre la tasa de abandono o error propia de BBVA Perú en este flujo; así consignado en la Tabla 25 del Entregable 2 [V].</w:t>
+            </w:r>
+            <w:commentRangeEnd w:id="8"/>
+            <w:r>
+              <w:rPr>
+                <w:rStyle w:val="CommentReference"/>
+              </w:rPr>
+              <w:commentReference w:id="8"/>
+            </w:r>
+            <w:r>
+              <w:rPr>
+                <w:rtl w:val="0"/>
+              </w:rPr>
+              <w:t xml:space="preserve"> Referencia de industria, no propia de BBVA Perú: la automatización conversacional del onboarding reduce el abandono de solicitudes hasta en 18 % (Kore.ai, 2026), lo que sugiere que el abandono es un fenómeno relevante en la industria [F referencial].</w:t>
             </w:r>
           </w:p>
         </w:tc>
@@ -5284,11 +5603,19 @@
               <w:jc w:val="both"/>
               <w:rPr/>
             </w:pPr>
+            <w:commentRangeStart w:id="9"/>
             <w:r>
               <w:rPr>
                 <w:rtl w:val="0"/>
               </w:rPr>
               <w:t xml:space="preserve">NO HAY FUENTES EN INTERNET DISPONIBLES sobre el costo de adquisición por canal en BBVA Perú; así consignado en la Tabla 25 del Entregable 2 [V].</w:t>
+            </w:r>
+            <w:commentRangeEnd w:id="9"/>
+            <w:r>
+              <w:rPr>
+                <w:rStyle w:val="CommentReference"/>
+              </w:rPr>
+              <w:commentReference w:id="9"/>
             </w:r>
           </w:p>
         </w:tc>
@@ -5392,6 +5719,9 @@
           <w:rtl w:val="0"/>
         </w:rPr>
         <w:t xml:space="preserve">De los tres dolores, DC1 y DC3 comparten el mismo tipo de vacío: ninguno cuenta con línea base pública de tiempos ni de costos para su ruta asistida o derivada, porque esa información corresponde a gestión interna que la entidad no publica en sus reportes al mercado —la misma limitación ya declarada en la sección 4.4 del Entregable 2—. DC2 es el único de los tres dolores críticos que cuenta con una línea base pública completa de tiempos e indicadores de volumen, por derivar de un reporte regulatorio de periodicidad mensual. Esta asimetría en la disponibilidad de evidencia debe considerarse al momento de definir el orden de implementación de las tres iniciativas: la hipótesis del DC2 es la que puede medirse desde el primer día sin depender de un levantamiento interno previo.</w:t>
+      </w:r>
+      <w:r>
+        <w:t xml:space="preserve"> No obstante esta asimetría, el equipo ha decidido concentrar el desarrollo de la iniciativa a partir de esta entrega en el dolor DC3, conforme a los motivos de disponibilidad de información expuestos en la sección 5.1; el primer objetivo de la fase de implementación será cerrar precisamente el vacío de línea base señalado en el párrafo anterior, mediante levantamiento interno o mediante instrumentación directa del propio agente conversacional propuesto en la sección 5.4.</w:t>
       </w:r>
     </w:p>
     <w:p>
@@ -5892,6 +6222,29 @@
         <w:rPr>
           <w:rtl w:val="0"/>
         </w:rPr>
+        <w:t xml:space="preserve">Europa Press. (2026, 1 de setiembre). Revolut lanza Air en España, su nuevo asistente de inteligencia artificial para gestionar las finanzas. Bolsamanía. </w:t>
+      </w:r>
+      <w:hyperlink r:id="rId30">
+        <w:r>
+          <w:rPr>
+            <w:color w:val="1155cc"/>
+            <w:u w:val="single"/>
+            <w:rtl w:val="0"/>
+          </w:rPr>
+          <w:t xml:space="preserve">https://www.bolsamania.com/noticias/mercados/economia--revolut-lanza-air-en-espana-su-nuevo-asistente-de-inteligencia-artificial-para-gestionar-las-finanzas--23442762.html</w:t>
+        </w:r>
+      </w:hyperlink>
+    </w:p>
+    <w:p>
+      <w:pPr>
+        <w:spacing w:after="160" w:line="360" w:lineRule="auto"/>
+        <w:ind w:left="720" w:hanging="720"/>
+        <w:rPr/>
+      </w:pPr>
+      <w:r>
+        <w:rPr>
+          <w:rtl w:val="0"/>
+        </w:rPr>
         <w:t xml:space="preserve">Kim, W. C., &amp; Mauborgne, R. (2005). </w:t>
       </w:r>
       <w:r>
@@ -6315,6 +6668,283 @@
     </w:sectPr>
   </w:body>
 </w:document>
+</file>
+
+<file path=word/comments.xml><?xml version="1.0" encoding="utf-8"?>
+<w:comments xmlns:a="http://schemas.openxmlformats.org/drawingml/2006/main" xmlns:pic="http://schemas.openxmlformats.org/drawingml/2006/picture" xmlns:r="http://schemas.openxmlformats.org/officeDocument/2006/relationships" xmlns:w="http://schemas.openxmlformats.org/wordprocessingml/2006/main" xmlns:wp="http://schemas.openxmlformats.org/drawingml/2006/wordprocessingDrawing" xmlns:mc="http://schemas.openxmlformats.org/markup-compatibility/2006" xmlns:a14="http://schemas.microsoft.com/office/drawing/2010/main" xmlns:w14="http://schemas.microsoft.com/office/word/2010/wordml" xmlns:wpc="http://schemas.microsoft.com/office/word/2010/wordprocessingCanvas">
+  <w:comment w:id="0" w:author="Equipo — nota de revisión" w:initials="NR" w:date="2026-09-24T04:58:44Z">
+    <w:p>
+      <w:pPr>
+        <w:pStyle w:val="CommentText"/>
+      </w:pPr>
+      <w:r>
+        <w:rPr>
+          <w:rStyle w:val="CommentReference"/>
+        </w:rPr>
+        <w:annotationRef/>
+      </w:r>
+      <w:r>
+        <w:t>Validar: no se encontró fuente pública para el tiempo promedio de la ruta asistida de originación de crédito Pyme. Buscar en reportes de gestión más recientes de BBVA Perú o consultar directamente a A. Moquillaza.</w:t>
+      </w:r>
+    </w:p>
+  </w:comment>
+  <w:comment w:id="1" w:author="Equipo — nota de revisión" w:initials="NR" w:date="2026-09-24T04:58:44Z">
+    <w:p>
+      <w:pPr>
+        <w:pStyle w:val="CommentText"/>
+      </w:pPr>
+      <w:r>
+        <w:rPr>
+          <w:rStyle w:val="CommentReference"/>
+        </w:rPr>
+        <w:annotationRef/>
+      </w:r>
+      <w:r>
+        <w:t>Validar: no hay fuente propia de BBVA Perú sobre la tasa de error o reproceso en esta etapa; solo se dispone de una referencia sectorial indirecta (Melo, 2026). Buscar una fuente más específica o consultar a A. Moquillaza.</w:t>
+      </w:r>
+    </w:p>
+  </w:comment>
+  <w:comment w:id="2" w:author="Equipo — nota de revisión" w:initials="NR" w:date="2026-09-24T04:58:44Z">
+    <w:p>
+      <w:pPr>
+        <w:pStyle w:val="CommentText"/>
+      </w:pPr>
+      <w:r>
+        <w:rPr>
+          <w:rStyle w:val="CommentReference"/>
+        </w:rPr>
+        <w:annotationRef/>
+      </w:r>
+      <w:r>
+        <w:t>Validar: no se encontró el costo unitario de originación por canal en BBVA Perú. Buscar en internet o consultar a A. Moquillaza.</w:t>
+      </w:r>
+    </w:p>
+  </w:comment>
+  <w:comment w:id="3" w:author="Equipo — nota de revisión" w:initials="NR" w:date="2026-09-24T04:58:44Z">
+    <w:p>
+      <w:pPr>
+        <w:pStyle w:val="CommentText"/>
+      </w:pPr>
+      <w:r>
+        <w:rPr>
+          <w:rStyle w:val="CommentReference"/>
+        </w:rPr>
+        <w:annotationRef/>
+      </w:r>
+      <w:r>
+        <w:t>Cifra de un mercado no peruano (hipotecario, EE. UU.), ya señalada en el texto como no extrapolable. Evaluar si existe un estudio equivalente para banca Pyme en Perú o América Latina que la sustituya o complemente.</w:t>
+      </w:r>
+    </w:p>
+  </w:comment>
+  <w:comment w:id="4" w:author="Equipo — nota de revisión" w:initials="NR" w:date="2026-09-24T04:58:44Z">
+    <w:p>
+      <w:pPr>
+        <w:pStyle w:val="CommentText"/>
+      </w:pPr>
+      <w:r>
+        <w:rPr>
+          <w:rStyle w:val="CommentReference"/>
+        </w:rPr>
+        <w:annotationRef/>
+      </w:r>
+      <w:r>
+        <w:t>Validar: no hay fuente propia de BBVA Perú sobre el tipo de error operativo en este proceso; solo se dispone de evidencia indirecta de exposición sancionatoria (Alarcón, 2023). Buscar una fuente más específica o consultar a A. Moquillaza.</w:t>
+      </w:r>
+    </w:p>
+  </w:comment>
+  <w:comment w:id="5" w:author="Equipo — nota de revisión" w:initials="NR" w:date="2026-09-24T04:58:44Z">
+    <w:p>
+      <w:pPr>
+        <w:pStyle w:val="CommentText"/>
+      </w:pPr>
+      <w:r>
+        <w:rPr>
+          <w:rStyle w:val="CommentReference"/>
+        </w:rPr>
+        <w:annotationRef/>
+      </w:r>
+      <w:r>
+        <w:t>Validar: no se encontró el costo operativo propio de BBVA Perú por caso de reclamo. Buscar en internet o consultar a A. Moquillaza.</w:t>
+      </w:r>
+    </w:p>
+  </w:comment>
+  <w:comment w:id="6" w:author="Equipo — nota de revisión" w:initials="NR" w:date="2026-09-24T04:58:44Z">
+    <w:p>
+      <w:pPr>
+        <w:pStyle w:val="CommentText"/>
+      </w:pPr>
+      <w:r>
+        <w:rPr>
+          <w:rStyle w:val="CommentReference"/>
+        </w:rPr>
+        <w:annotationRef/>
+      </w:r>
+      <w:r>
+        <w:t>Cifra de bancos estadounidenses, ya señalada en el texto como no atribuible a BBVA Perú. Evaluar si existe una cifra sectorial peruana (por ejemplo, de la SBS o Indecopi) que la sustituya o complemente.</w:t>
+      </w:r>
+    </w:p>
+  </w:comment>
+  <w:comment w:id="7" w:author="Equipo — nota de revisión" w:initials="NR" w:date="2026-09-24T04:58:44Z">
+    <w:p>
+      <w:pPr>
+        <w:pStyle w:val="CommentText"/>
+      </w:pPr>
+      <w:r>
+        <w:rPr>
+          <w:rStyle w:val="CommentReference"/>
+        </w:rPr>
+        <w:annotationRef/>
+      </w:r>
+      <w:r>
+        <w:t>Validar: A. Moquillaza confirmó que existe una derivación a oficina física para estos perfiles, pero no se cuenta con su duración. Consultarle directamente para obtener una cifra o estimado.</w:t>
+      </w:r>
+    </w:p>
+  </w:comment>
+  <w:comment w:id="8" w:author="Equipo — nota de revisión" w:initials="NR" w:date="2026-09-24T04:58:44Z">
+    <w:p>
+      <w:pPr>
+        <w:pStyle w:val="CommentText"/>
+      </w:pPr>
+      <w:r>
+        <w:rPr>
+          <w:rStyle w:val="CommentReference"/>
+        </w:rPr>
+        <w:annotationRef/>
+      </w:r>
+      <w:r>
+        <w:t>Validar: no hay fuente propia de BBVA Perú sobre la tasa de abandono en este flujo; solo se dispone de una referencia de industria (Kore.ai, 2026). Buscar una fuente más específica o consultar a A. Moquillaza.</w:t>
+      </w:r>
+    </w:p>
+  </w:comment>
+  <w:comment w:id="9" w:author="Equipo — nota de revisión" w:initials="NR" w:date="2026-09-24T04:58:44Z">
+    <w:p>
+      <w:pPr>
+        <w:pStyle w:val="CommentText"/>
+      </w:pPr>
+      <w:r>
+        <w:rPr>
+          <w:rStyle w:val="CommentReference"/>
+        </w:rPr>
+        <w:annotationRef/>
+      </w:r>
+      <w:r>
+        <w:t>Validar: no se encontró ninguna fuente, ni siquiera referencial, sobre el costo de adquisición por canal en BBVA Perú. Buscar en internet o consultar a A. Moquillaza.</w:t>
+      </w:r>
+    </w:p>
+  </w:comment>
+  <w:comment w:id="10" w:author="Equipo — nota de revisión" w:initials="NR" w:date="2026-09-24T04:59:06Z">
+    <w:p>
+      <w:pPr>
+        <w:pStyle w:val="CommentText"/>
+      </w:pPr>
+      <w:r>
+        <w:rPr>
+          <w:rStyle w:val="CommentReference"/>
+        </w:rPr>
+        <w:annotationRef/>
+      </w:r>
+      <w:r>
+        <w:t>La meta de 60 % fue propuesta por el equipo y aún no ha sido validada con la entidad, conforme a lo señalado en la sección 4.3 del Entregable 2. Confirmar su viabilidad, de ser posible, con A. Moquillaza u otra fuente de BBVA Perú.</w:t>
+      </w:r>
+    </w:p>
+  </w:comment>
+  <w:comment w:id="11" w:author="Equipo — nota de revisión" w:initials="NR" w:date="2026-09-24T04:59:06Z">
+    <w:p>
+      <w:pPr>
+        <w:pStyle w:val="CommentText"/>
+      </w:pPr>
+      <w:r>
+        <w:rPr>
+          <w:rStyle w:val="CommentReference"/>
+        </w:rPr>
+        <w:annotationRef/>
+      </w:r>
+      <w:r>
+        <w:t>La meta de convergencia a 8.02 días fue propuesta por el equipo y aún no ha sido validada con la entidad, conforme a lo señalado en la sección 4.3 del Entregable 2. Confirmar su viabilidad de ser posible.</w:t>
+      </w:r>
+    </w:p>
+  </w:comment>
+  <w:comment w:id="12" w:author="Equipo — nota de revisión" w:initials="NR" w:date="2026-09-24T04:59:06Z">
+    <w:p>
+      <w:pPr>
+        <w:pStyle w:val="CommentText"/>
+      </w:pPr>
+      <w:r>
+        <w:rPr>
+          <w:rStyle w:val="CommentReference"/>
+        </w:rPr>
+        <w:annotationRef/>
+      </w:r>
+      <w:r>
+        <w:t>La meta de 55 % fue propuesta por el equipo y aún no ha sido validada con la entidad, conforme a lo señalado en la sección 4.3 del Entregable 2. Confirmar su viabilidad, de ser posible, con A. Moquillaza.</w:t>
+      </w:r>
+    </w:p>
+  </w:comment>
+  <w:comment w:id="13" w:author="Equipo — nota de revisión" w:initials="NR" w:date="2026-09-24T04:59:06Z">
+    <w:p>
+      <w:pPr>
+        <w:pStyle w:val="CommentText"/>
+      </w:pPr>
+      <w:r>
+        <w:rPr>
+          <w:rStyle w:val="CommentReference"/>
+        </w:rPr>
+        <w:annotationRef/>
+      </w:r>
+      <w:r>
+        <w:t>Las cifras citadas en este párrafo (Sundararajan y Jeenah, 2025; Stealth Agents, 2026; Kore.ai, 2026) provienen de mercados desarrollados, tal como ya advierte el propio texto. Si el tiempo lo permite, buscar un estudio o cifra equivalente para banca Pyme en Perú o América Latina.</w:t>
+      </w:r>
+    </w:p>
+  </w:comment>
+  <w:comment w:id="14" w:author="Equipo — nota de revisión" w:initials="NR" w:date="2026-09-24T04:59:06Z">
+    <w:p>
+      <w:pPr>
+        <w:pStyle w:val="CommentText"/>
+      </w:pPr>
+      <w:r>
+        <w:rPr>
+          <w:rStyle w:val="CommentReference"/>
+        </w:rPr>
+        <w:annotationRef/>
+      </w:r>
+      <w:r>
+        <w:t>Las cifras citadas en este párrafo (Backbase, 2026; Kore.ai, 2026) no son propias de BBVA Perú, tal como ya advierte el propio texto. Si el tiempo lo permite, buscar una cifra peruana o regional equivalente sobre automatización de disputas.</w:t>
+      </w:r>
+    </w:p>
+  </w:comment>
+  <w:comment w:id="15" w:author="Equipo — nota de revisión" w:initials="NR" w:date="2026-09-24T04:59:06Z">
+    <w:p>
+      <w:pPr>
+        <w:pStyle w:val="CommentText"/>
+      </w:pPr>
+      <w:r>
+        <w:rPr>
+          <w:rStyle w:val="CommentReference"/>
+        </w:rPr>
+        <w:annotationRef/>
+      </w:r>
+      <w:r>
+        <w:t>La cifra de Kore.ai (2026) es de industria general, no específica de Perú. Mibanco y BCP sí aportan evidencia local, pero conviene verificar si existe un estudio adicional sobre onboarding digital en la banca peruana o latinoamericana.</w:t>
+      </w:r>
+    </w:p>
+  </w:comment>
+  <w:comment w:id="16" w:author="Equipo — nota de revisión" w:initials="NR" w:date="2026-09-24T04:59:06Z">
+    <w:p>
+      <w:pPr>
+        <w:pStyle w:val="CommentText"/>
+      </w:pPr>
+      <w:r>
+        <w:rPr>
+          <w:rStyle w:val="CommentReference"/>
+        </w:rPr>
+        <w:annotationRef/>
+      </w:r>
+      <w:r>
+        <w:t>Ninguna de las tres hipótesis se vincula explícitamente con el OE2 (Impulsar la sostenibilidad como motor de crecimiento). La Práctica 1 penalizó la falta de trazabilidad completa de los objetivos estratégicos (Tabla 12 del Entregable 1). Evaluar si corresponde justificar esta ausencia o preguntar al profesor/evaluador si se espera cobertura explícita de OE2 en esta entrega.</w:t>
+      </w:r>
+    </w:p>
+  </w:comment>
+</w:comments>
 </file>
 
 <file path=word/numbering.xml><?xml version="1.0" encoding="utf-8"?>

</xml_diff>